<commit_message>
Agragando README.md y capturas de pruebas con API del clima
</commit_message>
<xml_diff>
--- a/Api/API REST Sistema SmartGastro.docx
+++ b/Api/API REST Sistema SmartGastro.docx
@@ -5,24 +5,31 @@
     <w:p>
       <w:pPr>
         <w:spacing w:after="0"/>
-      </w:pPr>
-      <w:r>
-        <w:t xml:space="preserve">API REST sistema </w:t>
-      </w:r>
-      <w:proofErr w:type="spellStart"/>
-      <w:r>
-        <w:t>SmartGastro</w:t>
-      </w:r>
-      <w:proofErr w:type="spellEnd"/>
-    </w:p>
-    <w:p>
-      <w:pPr>
-        <w:spacing w:after="0"/>
-      </w:pPr>
-    </w:p>
-    <w:p>
-      <w:pPr>
-        <w:spacing w:after="0"/>
+        <w:ind w:left="426" w:right="827"/>
+        <w:jc w:val="center"/>
+        <w:rPr>
+          <w:sz w:val="56"/>
+          <w:szCs w:val="56"/>
+        </w:rPr>
+      </w:pPr>
+      <w:r>
+        <w:rPr>
+          <w:sz w:val="56"/>
+          <w:szCs w:val="56"/>
+        </w:rPr>
+        <w:t>API REST sistema SmartGastro</w:t>
+      </w:r>
+    </w:p>
+    <w:p>
+      <w:pPr>
+        <w:spacing w:after="0"/>
+        <w:ind w:left="426" w:right="827"/>
+      </w:pPr>
+    </w:p>
+    <w:p>
+      <w:pPr>
+        <w:spacing w:after="0"/>
+        <w:ind w:left="426" w:right="827"/>
       </w:pPr>
       <w:r>
         <w:t xml:space="preserve">Base de URL: </w:t>
@@ -39,11 +46,13 @@
     <w:p>
       <w:pPr>
         <w:spacing w:after="0"/>
-      </w:pPr>
-    </w:p>
-    <w:p>
-      <w:pPr>
-        <w:spacing w:after="0"/>
+        <w:ind w:left="426" w:right="827"/>
+      </w:pPr>
+    </w:p>
+    <w:p>
+      <w:pPr>
+        <w:spacing w:after="0"/>
+        <w:ind w:left="426" w:right="827"/>
       </w:pPr>
       <w:r>
         <w:t>Obtener Usuarios:</w:t>
@@ -52,6 +61,7 @@
     <w:p>
       <w:pPr>
         <w:spacing w:after="0"/>
+        <w:ind w:left="426" w:right="827"/>
       </w:pPr>
       <w:r>
         <w:t>Método: GET</w:t>
@@ -60,6 +70,7 @@
     <w:p>
       <w:pPr>
         <w:spacing w:after="0"/>
+        <w:ind w:left="426" w:right="827"/>
       </w:pPr>
       <w:r>
         <w:t xml:space="preserve">URL: </w:t>
@@ -76,6 +87,7 @@
     <w:p>
       <w:pPr>
         <w:spacing w:after="0"/>
+        <w:ind w:left="426" w:right="827"/>
       </w:pPr>
       <w:r>
         <w:t>Body: no requiere</w:t>
@@ -84,11 +96,13 @@
     <w:p>
       <w:pPr>
         <w:spacing w:after="0"/>
-      </w:pPr>
-    </w:p>
-    <w:p>
-      <w:pPr>
-        <w:spacing w:after="0"/>
+        <w:ind w:left="426" w:right="827"/>
+      </w:pPr>
+    </w:p>
+    <w:p>
+      <w:pPr>
+        <w:spacing w:after="0"/>
+        <w:ind w:left="426" w:right="827"/>
       </w:pPr>
       <w:r>
         <w:t>Crear Usuarios:</w:t>
@@ -97,6 +111,7 @@
     <w:p>
       <w:pPr>
         <w:spacing w:after="0"/>
+        <w:ind w:left="426" w:right="827"/>
       </w:pPr>
       <w:r>
         <w:t>Método</w:t>
@@ -108,6 +123,7 @@
     <w:p>
       <w:pPr>
         <w:spacing w:after="0"/>
+        <w:ind w:left="426" w:right="827"/>
       </w:pPr>
       <w:r>
         <w:t xml:space="preserve">URL: </w:t>
@@ -124,6 +140,7 @@
     <w:p>
       <w:pPr>
         <w:spacing w:after="0"/>
+        <w:ind w:left="426" w:right="827"/>
       </w:pPr>
       <w:r>
         <w:t xml:space="preserve">Body: { </w:t>
@@ -132,26 +149,20 @@
     <w:p>
       <w:pPr>
         <w:spacing w:after="0"/>
+        <w:ind w:left="426" w:right="827"/>
       </w:pPr>
       <w:r>
         <w:t xml:space="preserve">    </w:t>
       </w:r>
       <w:r>
         <w:tab/>
-        <w:t xml:space="preserve">   “nombre”: “Juan </w:t>
-      </w:r>
-      <w:proofErr w:type="spellStart"/>
-      <w:r>
-        <w:t>Gomez</w:t>
-      </w:r>
-      <w:proofErr w:type="spellEnd"/>
-      <w:r>
-        <w:t>”,</w:t>
-      </w:r>
-    </w:p>
-    <w:p>
-      <w:pPr>
-        <w:spacing w:after="0"/>
+        <w:t xml:space="preserve">   “nombre”: “Juan Gomez”,</w:t>
+      </w:r>
+    </w:p>
+    <w:p>
+      <w:pPr>
+        <w:spacing w:after="0"/>
+        <w:ind w:left="426" w:right="827"/>
       </w:pPr>
       <w:r>
         <w:tab/>
@@ -172,6 +183,7 @@
     <w:p>
       <w:pPr>
         <w:spacing w:after="0"/>
+        <w:ind w:left="426" w:right="827"/>
       </w:pPr>
       <w:r>
         <w:tab/>
@@ -181,6 +193,7 @@
     <w:p>
       <w:pPr>
         <w:spacing w:after="0"/>
+        <w:ind w:left="426" w:right="827"/>
       </w:pPr>
       <w:r>
         <w:tab/>
@@ -190,6 +203,7 @@
     <w:p>
       <w:pPr>
         <w:spacing w:after="0"/>
+        <w:ind w:left="426" w:right="827"/>
       </w:pPr>
       <w:r>
         <w:tab/>
@@ -198,34 +212,25 @@
     <w:p>
       <w:pPr>
         <w:spacing w:after="0"/>
-      </w:pPr>
-      <w:r>
-        <w:t>Modificar</w:t>
-      </w:r>
-      <w:r>
-        <w:t xml:space="preserve"> Usuarios:</w:t>
-      </w:r>
-    </w:p>
-    <w:p>
-      <w:pPr>
-        <w:spacing w:after="0"/>
-      </w:pPr>
-      <w:r>
-        <w:t>Método</w:t>
-      </w:r>
-      <w:r>
-        <w:t>: P</w:t>
-      </w:r>
-      <w:r>
-        <w:t>U</w:t>
-      </w:r>
-      <w:r>
-        <w:t>T</w:t>
-      </w:r>
-    </w:p>
-    <w:p>
-      <w:pPr>
-        <w:spacing w:after="0"/>
+        <w:ind w:left="426" w:right="827"/>
+      </w:pPr>
+      <w:r>
+        <w:t>Modificar Usuarios:</w:t>
+      </w:r>
+    </w:p>
+    <w:p>
+      <w:pPr>
+        <w:spacing w:after="0"/>
+        <w:ind w:left="426" w:right="827"/>
+      </w:pPr>
+      <w:r>
+        <w:t>Método: PUT</w:t>
+      </w:r>
+    </w:p>
+    <w:p>
+      <w:pPr>
+        <w:spacing w:after="0"/>
+        <w:ind w:left="426" w:right="827"/>
       </w:pPr>
       <w:r>
         <w:t xml:space="preserve">URL: </w:t>
@@ -245,6 +250,7 @@
     <w:p>
       <w:pPr>
         <w:spacing w:after="0"/>
+        <w:ind w:left="426" w:right="827"/>
       </w:pPr>
       <w:r>
         <w:t xml:space="preserve">Body: { </w:t>
@@ -253,26 +259,20 @@
     <w:p>
       <w:pPr>
         <w:spacing w:after="0"/>
+        <w:ind w:left="426" w:right="827"/>
       </w:pPr>
       <w:r>
         <w:t xml:space="preserve">    </w:t>
       </w:r>
       <w:r>
         <w:tab/>
-        <w:t xml:space="preserve">   “nombre”: “Juan </w:t>
-      </w:r>
-      <w:proofErr w:type="spellStart"/>
-      <w:r>
-        <w:t>Gomez</w:t>
-      </w:r>
-      <w:proofErr w:type="spellEnd"/>
-      <w:r>
-        <w:t>”,</w:t>
-      </w:r>
-    </w:p>
-    <w:p>
-      <w:pPr>
-        <w:spacing w:after="0"/>
+        <w:t xml:space="preserve">   “nombre”: “Juan Gomez”,</w:t>
+      </w:r>
+    </w:p>
+    <w:p>
+      <w:pPr>
+        <w:spacing w:after="0"/>
+        <w:ind w:left="426" w:right="827"/>
       </w:pPr>
       <w:r>
         <w:tab/>
@@ -293,23 +293,17 @@
     <w:p>
       <w:pPr>
         <w:spacing w:after="0"/>
+        <w:ind w:left="426" w:right="827"/>
       </w:pPr>
       <w:r>
         <w:tab/>
-        <w:t xml:space="preserve">   “rol”: “</w:t>
-      </w:r>
-      <w:proofErr w:type="spellStart"/>
-      <w:r>
-        <w:t>admin</w:t>
-      </w:r>
-      <w:proofErr w:type="spellEnd"/>
-      <w:r>
-        <w:t>”</w:t>
-      </w:r>
-    </w:p>
-    <w:p>
-      <w:pPr>
-        <w:spacing w:after="0"/>
+        <w:t xml:space="preserve">   “rol”: “admin”</w:t>
+      </w:r>
+    </w:p>
+    <w:p>
+      <w:pPr>
+        <w:spacing w:after="0"/>
+        <w:ind w:left="426" w:right="827"/>
       </w:pPr>
       <w:r>
         <w:tab/>
@@ -319,6 +313,7 @@
     <w:p>
       <w:pPr>
         <w:spacing w:after="0"/>
+        <w:ind w:left="426" w:right="827"/>
       </w:pPr>
       <w:r>
         <w:t xml:space="preserve">    </w:t>
@@ -327,31 +322,25 @@
     <w:p>
       <w:pPr>
         <w:spacing w:after="0"/>
-      </w:pPr>
-      <w:r>
-        <w:t>Eliminar</w:t>
-      </w:r>
-      <w:r>
-        <w:t xml:space="preserve"> Usuarios:</w:t>
-      </w:r>
-    </w:p>
-    <w:p>
-      <w:pPr>
-        <w:spacing w:after="0"/>
-      </w:pPr>
-      <w:r>
-        <w:t>Método</w:t>
-      </w:r>
-      <w:r>
-        <w:t xml:space="preserve">: </w:t>
-      </w:r>
-      <w:r>
-        <w:t>DELETE</w:t>
-      </w:r>
-    </w:p>
-    <w:p>
-      <w:pPr>
-        <w:spacing w:after="0"/>
+        <w:ind w:left="426" w:right="827"/>
+      </w:pPr>
+      <w:r>
+        <w:t>Eliminar Usuarios:</w:t>
+      </w:r>
+    </w:p>
+    <w:p>
+      <w:pPr>
+        <w:spacing w:after="0"/>
+        <w:ind w:left="426" w:right="827"/>
+      </w:pPr>
+      <w:r>
+        <w:t>Método: DELETE</w:t>
+      </w:r>
+    </w:p>
+    <w:p>
+      <w:pPr>
+        <w:spacing w:after="0"/>
+        <w:ind w:left="426" w:right="827"/>
       </w:pPr>
       <w:r>
         <w:t xml:space="preserve">URL: </w:t>
@@ -371,16 +360,21 @@
     <w:p>
       <w:pPr>
         <w:spacing w:after="0"/>
-      </w:pPr>
-      <w:r>
-        <w:t xml:space="preserve">Body: </w:t>
-      </w:r>
-      <w:r>
-        <w:t xml:space="preserve"> no requiere</w:t>
-      </w:r>
-    </w:p>
-    <w:p/>
-    <w:p>
+        <w:ind w:left="426" w:right="827"/>
+      </w:pPr>
+      <w:r>
+        <w:t>Body:  no requiere</w:t>
+      </w:r>
+    </w:p>
+    <w:p>
+      <w:pPr>
+        <w:ind w:left="426" w:right="827"/>
+      </w:pPr>
+    </w:p>
+    <w:p>
+      <w:pPr>
+        <w:ind w:left="426" w:right="827"/>
+      </w:pPr>
       <w:r>
         <w:tab/>
       </w:r>
@@ -388,9 +382,182 @@
         <w:tab/>
       </w:r>
     </w:p>
+    <w:p>
+      <w:pPr>
+        <w:ind w:left="426" w:right="827"/>
+      </w:pPr>
+    </w:p>
+    <w:p>
+      <w:pPr>
+        <w:ind w:left="426" w:right="827"/>
+      </w:pPr>
+    </w:p>
+    <w:p>
+      <w:pPr>
+        <w:ind w:left="426" w:right="827"/>
+      </w:pPr>
+    </w:p>
+    <w:p>
+      <w:pPr>
+        <w:ind w:left="426" w:right="827"/>
+      </w:pPr>
+    </w:p>
+    <w:p>
+      <w:pPr>
+        <w:ind w:left="426" w:right="827"/>
+      </w:pPr>
+    </w:p>
+    <w:p>
+      <w:pPr>
+        <w:ind w:left="426" w:right="827"/>
+        <w:jc w:val="center"/>
+        <w:rPr>
+          <w:sz w:val="56"/>
+          <w:szCs w:val="56"/>
+        </w:rPr>
+      </w:pPr>
+      <w:r>
+        <w:rPr>
+          <w:sz w:val="56"/>
+          <w:szCs w:val="56"/>
+        </w:rPr>
+        <w:lastRenderedPageBreak/>
+        <w:t>API Clima</w:t>
+      </w:r>
+    </w:p>
+    <w:p>
+      <w:pPr>
+        <w:ind w:left="426" w:right="827"/>
+      </w:pPr>
+      <w:r>
+        <w:t>Se realizaron pruebas utilizando Postman sobre la API OpenWeatherMap para consultar información climática en tiempo real mediante solicitudes HTTP GET.</w:t>
+      </w:r>
+    </w:p>
+    <w:p>
+      <w:pPr>
+        <w:ind w:left="426" w:right="827"/>
+      </w:pPr>
+      <w:r>
+        <w:t>La API respondió correctamente en formato JSON, devolviendo datos como temperatura, humedad y estado del clima.</w:t>
+      </w:r>
+    </w:p>
+    <w:p>
+      <w:pPr>
+        <w:ind w:left="426" w:right="827"/>
+      </w:pPr>
+      <w:r>
+        <w:t>Capturas de Pantalla</w:t>
+      </w:r>
+    </w:p>
+    <w:p>
+      <w:pPr>
+        <w:ind w:left="426" w:right="827"/>
+      </w:pPr>
+      <w:r>
+        <w:t>Clima del día:</w:t>
+      </w:r>
+    </w:p>
+    <w:p>
+      <w:pPr>
+        <w:ind w:left="426" w:right="827"/>
+      </w:pPr>
+      <w:r>
+        <w:drawing>
+          <wp:inline distT="0" distB="0" distL="0" distR="0" wp14:anchorId="3553C95E" wp14:editId="413D30EF">
+            <wp:extent cx="5400040" cy="3037205"/>
+            <wp:effectExtent l="0" t="0" r="0" b="0"/>
+            <wp:docPr id="1051592863" name="Imagen 1"/>
+            <wp:cNvGraphicFramePr>
+              <a:graphicFrameLocks xmlns:a="http://schemas.openxmlformats.org/drawingml/2006/main" noChangeAspect="1"/>
+            </wp:cNvGraphicFramePr>
+            <a:graphic xmlns:a="http://schemas.openxmlformats.org/drawingml/2006/main">
+              <a:graphicData uri="http://schemas.openxmlformats.org/drawingml/2006/picture">
+                <pic:pic xmlns:pic="http://schemas.openxmlformats.org/drawingml/2006/picture">
+                  <pic:nvPicPr>
+                    <pic:cNvPr id="1051592863" name=""/>
+                    <pic:cNvPicPr/>
+                  </pic:nvPicPr>
+                  <pic:blipFill>
+                    <a:blip r:embed="rId11"/>
+                    <a:stretch>
+                      <a:fillRect/>
+                    </a:stretch>
+                  </pic:blipFill>
+                  <pic:spPr>
+                    <a:xfrm>
+                      <a:off x="0" y="0"/>
+                      <a:ext cx="5400040" cy="3037205"/>
+                    </a:xfrm>
+                    <a:prstGeom prst="rect">
+                      <a:avLst/>
+                    </a:prstGeom>
+                  </pic:spPr>
+                </pic:pic>
+              </a:graphicData>
+            </a:graphic>
+          </wp:inline>
+        </w:drawing>
+      </w:r>
+    </w:p>
+    <w:p>
+      <w:pPr>
+        <w:ind w:left="426" w:right="827"/>
+      </w:pPr>
+    </w:p>
+    <w:p>
+      <w:pPr>
+        <w:ind w:left="426" w:right="827" w:firstLine="284"/>
+      </w:pPr>
+      <w:r>
+        <w:t>Clima extendido por 5 Días:</w:t>
+      </w:r>
+      <w:r>
+        <w:rPr>
+          <w:noProof/>
+        </w:rPr>
+        <w:t xml:space="preserve"> </w:t>
+      </w:r>
+      <w:r>
+        <w:drawing>
+          <wp:inline distT="0" distB="0" distL="0" distR="0" wp14:anchorId="47F883DD" wp14:editId="172B26FC">
+            <wp:extent cx="5400040" cy="3037205"/>
+            <wp:effectExtent l="0" t="0" r="0" b="0"/>
+            <wp:docPr id="1577843802" name="Imagen 1"/>
+            <wp:cNvGraphicFramePr>
+              <a:graphicFrameLocks xmlns:a="http://schemas.openxmlformats.org/drawingml/2006/main" noChangeAspect="1"/>
+            </wp:cNvGraphicFramePr>
+            <a:graphic xmlns:a="http://schemas.openxmlformats.org/drawingml/2006/main">
+              <a:graphicData uri="http://schemas.openxmlformats.org/drawingml/2006/picture">
+                <pic:pic xmlns:pic="http://schemas.openxmlformats.org/drawingml/2006/picture">
+                  <pic:nvPicPr>
+                    <pic:cNvPr id="1577843802" name=""/>
+                    <pic:cNvPicPr/>
+                  </pic:nvPicPr>
+                  <pic:blipFill>
+                    <a:blip r:embed="rId12"/>
+                    <a:stretch>
+                      <a:fillRect/>
+                    </a:stretch>
+                  </pic:blipFill>
+                  <pic:spPr>
+                    <a:xfrm>
+                      <a:off x="0" y="0"/>
+                      <a:ext cx="5400040" cy="3037205"/>
+                    </a:xfrm>
+                    <a:prstGeom prst="rect">
+                      <a:avLst/>
+                    </a:prstGeom>
+                  </pic:spPr>
+                </pic:pic>
+              </a:graphicData>
+            </a:graphic>
+          </wp:inline>
+        </w:drawing>
+      </w:r>
+    </w:p>
     <w:sectPr>
-      <w:pgSz w:w="11906" w:h="16838"/>
-      <w:pgMar w:top="1417" w:right="1701" w:bottom="1417" w:left="1701" w:header="708" w:footer="708" w:gutter="0"/>
+      <w:pgSz w:w="11906" w:h="16838" w:code="9"/>
+      <w:pgMar w:top="1560" w:right="720" w:bottom="720" w:left="720" w:header="708" w:footer="708" w:gutter="0"/>
       <w:cols w:space="708"/>
       <w:docGrid w:linePitch="360"/>
     </w:sectPr>

</xml_diff>